<commit_message>
docs: Document SMB access retries (3 attempts, 10s apart)
Added the retry behavior to the master doc, the API contract (with the
production response-time implication) and the Word generator; regenerated
the .docx.

Co-Authored-By: Claude Opus 4.8 <noreply@anthropic.com>
</commit_message>
<xml_diff>
--- a/docs/INT5-DOCUMENTACION-TECNICA.docx
+++ b/docs/INT5-DOCUMENTACION-TECNICA.docx
@@ -2503,7 +2503,113 @@
         <w:spacing w:after="120"/>
       </w:pPr>
       <w:r>
-        <w:t xml:space="preserve">Helper compartido por los endpoints de producto CSV: valida la config, descifra la contraseña SMB, lee el archivo del recurso y parsea las filas.</w:t>
+        <w:t xml:space="preserve">Helper compartido por los endpoints de producto CSV: valida la config, descifra la contraseña SMB, detecta el archivo por patrón en cada llamada (soporta nombres dinámicos como data_YYYYMMDD.csv), lo lee y parsea las filas.</w:t>
+      </w:r>
+    </w:p>
+    <w:p>
+      <w:pPr>
+        <w:pStyle w:val="Heading2"/>
+      </w:pPr>
+      <w:r>
+        <w:t xml:space="preserve">Reintentos de acceso SMB</w:t>
+      </w:r>
+    </w:p>
+    <w:p>
+      <w:pPr>
+        <w:spacing w:after="120"/>
+      </w:pPr>
+      <w:r>
+        <w:t xml:space="preserve">El acceso al archivo (detección + lectura) se reintenta ante fallos transitorios de red:</w:t>
+      </w:r>
+    </w:p>
+    <w:p>
+      <w:pPr>
+        <w:pBdr>
+          <w:top w:val="single" w:color="D9D9D9" w:sz="4"/>
+          <w:bottom w:val="single" w:color="D9D9D9" w:sz="4"/>
+          <w:left w:val="single" w:color="D9D9D9" w:sz="4"/>
+          <w:right w:val="single" w:color="D9D9D9" w:sz="4"/>
+        </w:pBdr>
+        <w:shd w:fill="F2F2F2" w:val="clear"/>
+        <w:spacing w:after="120" w:before="60"/>
+      </w:pPr>
+      <w:r>
+        <w:rPr>
+          <w:rFonts w:ascii="Consolas" w:cs="Consolas" w:eastAsia="Consolas" w:hAnsi="Consolas"/>
+          <w:sz w:val="18"/>
+          <w:szCs w:val="18"/>
+        </w:rPr>
+        <w:t xml:space="preserve">Intento 1 -&gt; falla -&gt; espera 10 s -&gt;</w:t>
+      </w:r>
+      <w:r>
+        <w:rPr>
+          <w:rFonts w:ascii="Consolas" w:cs="Consolas" w:eastAsia="Consolas" w:hAnsi="Consolas"/>
+          <w:sz w:val="18"/>
+          <w:szCs w:val="18"/>
+        </w:rPr>
+        <w:br/>
+        <w:t xml:space="preserve">Intento 2 -&gt; falla -&gt; espera 10 s -&gt;</w:t>
+      </w:r>
+      <w:r>
+        <w:rPr>
+          <w:rFonts w:ascii="Consolas" w:cs="Consolas" w:eastAsia="Consolas" w:hAnsi="Consolas"/>
+          <w:sz w:val="18"/>
+          <w:szCs w:val="18"/>
+        </w:rPr>
+        <w:br/>
+        <w:t xml:space="preserve">Intento 3 -&gt; falla -&gt; ERROR</w:t>
+      </w:r>
+    </w:p>
+    <w:p>
+      <w:pPr>
+        <w:pStyle w:val="ListParagraph"/>
+        <w:numPr>
+          <w:ilvl w:val="0"/>
+          <w:numId w:val="2"/>
+        </w:numPr>
+        <w:spacing w:after="60"/>
+      </w:pPr>
+      <w:r>
+        <w:t xml:space="preserve">3 intentos en total, 10 segundos entre cada uno (SMB_MAX_ATTEMPTS / SMB_RETRY_DELAY_MS en server.js).</w:t>
+      </w:r>
+    </w:p>
+    <w:p>
+      <w:pPr>
+        <w:pStyle w:val="ListParagraph"/>
+        <w:numPr>
+          <w:ilvl w:val="0"/>
+          <w:numId w:val="2"/>
+        </w:numPr>
+        <w:spacing w:after="60"/>
+      </w:pPr>
+      <w:r>
+        <w:t xml:space="preserve">Si cualquier intento tiene éxito, continúa de inmediato.</w:t>
+      </w:r>
+    </w:p>
+    <w:p>
+      <w:pPr>
+        <w:pStyle w:val="ListParagraph"/>
+        <w:numPr>
+          <w:ilvl w:val="0"/>
+          <w:numId w:val="2"/>
+        </w:numPr>
+        <w:spacing w:after="60"/>
+      </w:pPr>
+      <w:r>
+        <w:t xml:space="preserve">Solo se reintenta el acceso SMB. NOT_FOUND se decide en memoria tras leer el archivo y no se reintenta.</w:t>
+      </w:r>
+    </w:p>
+    <w:p>
+      <w:pPr>
+        <w:pStyle w:val="ListParagraph"/>
+        <w:numPr>
+          <w:ilvl w:val="0"/>
+          <w:numId w:val="2"/>
+        </w:numPr>
+        <w:spacing w:after="60"/>
+      </w:pPr>
+      <w:r>
+        <w:t xml:space="preserve">Implicación: con la red caída, la importación puede tardar ~20-30 s en devolver ERROR; producción debe contemplar esa espera.</w:t>
       </w:r>
     </w:p>
     <w:p>

</xml_diff>